<commit_message>
the exercise is to make some adjustment to the sytle.css codes
</commit_message>
<xml_diff>
--- a/Angela Web development note.docx
+++ b/Angela Web development note.docx
@@ -121,7 +121,118 @@
           <w:sz w:val="26"/>
           <w:szCs w:val="26"/>
         </w:rPr>
-        <w:t xml:space="preserve"> Void Element: These are the element that does not return any value. &lt;hr /&gt; The Horizontal element and Break keyw</w:t>
+        <w:t xml:space="preserve"> Void Element: These are the element that does not return any value. &lt;</w:t>
+      </w:r>
+      <w:proofErr w:type="spellStart"/>
+      <w:r>
+        <w:rPr>
+          <w:sz w:val="26"/>
+          <w:szCs w:val="26"/>
+        </w:rPr>
+        <w:t>hr</w:t>
+      </w:r>
+      <w:proofErr w:type="spellEnd"/>
+      <w:r>
+        <w:rPr>
+          <w:sz w:val="26"/>
+          <w:szCs w:val="26"/>
+        </w:rPr>
+        <w:t xml:space="preserve"> /&gt; The Horizontal element and Break key</w:t>
+      </w:r>
+    </w:p>
+    <w:p>
+      <w:pPr>
+        <w:rPr>
+          <w:sz w:val="26"/>
+          <w:szCs w:val="26"/>
+        </w:rPr>
+      </w:pPr>
+      <w:r>
+        <w:rPr>
+          <w:sz w:val="26"/>
+          <w:szCs w:val="26"/>
+        </w:rPr>
+        <w:t xml:space="preserve">This is the order of cascading in </w:t>
+      </w:r>
+      <w:proofErr w:type="spellStart"/>
+      <w:r>
+        <w:rPr>
+          <w:sz w:val="26"/>
+          <w:szCs w:val="26"/>
+        </w:rPr>
+        <w:t>css</w:t>
+      </w:r>
+      <w:proofErr w:type="spellEnd"/>
+      <w:r>
+        <w:rPr>
+          <w:sz w:val="26"/>
+          <w:szCs w:val="26"/>
+        </w:rPr>
+        <w:t xml:space="preserve">. </w:t>
+      </w:r>
+    </w:p>
+    <w:p>
+      <w:pPr>
+        <w:rPr>
+          <w:sz w:val="26"/>
+          <w:szCs w:val="26"/>
+        </w:rPr>
+      </w:pPr>
+      <w:r>
+        <w:rPr>
+          <w:sz w:val="26"/>
+          <w:szCs w:val="26"/>
+        </w:rPr>
+        <w:t xml:space="preserve">This might distort your programming so it is better you keep note of this </w:t>
+      </w:r>
+    </w:p>
+    <w:p>
+      <w:pPr>
+        <w:rPr>
+          <w:sz w:val="26"/>
+          <w:szCs w:val="26"/>
+        </w:rPr>
+      </w:pPr>
+      <w:r>
+        <w:rPr>
+          <w:sz w:val="26"/>
+          <w:szCs w:val="26"/>
+        </w:rPr>
+        <w:drawing>
+          <wp:inline distT="0" distB="0" distL="0" distR="0" wp14:anchorId="101510E1" wp14:editId="4430B4B4">
+            <wp:extent cx="6686550" cy="3730625"/>
+            <wp:effectExtent l="0" t="0" r="0" b="3175"/>
+            <wp:docPr id="934561061" name="Picture 1"/>
+            <wp:cNvGraphicFramePr>
+              <a:graphicFrameLocks xmlns:a="http://schemas.openxmlformats.org/drawingml/2006/main" noChangeAspect="1"/>
+            </wp:cNvGraphicFramePr>
+            <a:graphic xmlns:a="http://schemas.openxmlformats.org/drawingml/2006/main">
+              <a:graphicData uri="http://schemas.openxmlformats.org/drawingml/2006/picture">
+                <pic:pic xmlns:pic="http://schemas.openxmlformats.org/drawingml/2006/picture">
+                  <pic:nvPicPr>
+                    <pic:cNvPr id="934561061" name=""/>
+                    <pic:cNvPicPr/>
+                  </pic:nvPicPr>
+                  <pic:blipFill>
+                    <a:blip r:embed="rId6"/>
+                    <a:stretch>
+                      <a:fillRect/>
+                    </a:stretch>
+                  </pic:blipFill>
+                  <pic:spPr>
+                    <a:xfrm>
+                      <a:off x="0" y="0"/>
+                      <a:ext cx="6686550" cy="3730625"/>
+                    </a:xfrm>
+                    <a:prstGeom prst="rect">
+                      <a:avLst/>
+                    </a:prstGeom>
+                  </pic:spPr>
+                </pic:pic>
+              </a:graphicData>
+            </a:graphic>
+          </wp:inline>
+        </w:drawing>
       </w:r>
     </w:p>
     <w:sectPr>

</xml_diff>